<commit_message>
Update SOP with active contracts and calendar pages
Adds sections 2.6-2.7 documenting /loans and /calendar, and updates the
new-loan-creation walkthrough to reflect the post-save redirect to /loans.

Co-Authored-By: Claude Sonnet 5 <noreply@anthropic.com>
</commit_message>
<xml_diff>
--- a/docs/MoneyMore_SOP.docx
+++ b/docs/MoneyMore_SOP.docx
@@ -129,11 +129,7 @@
           </w:pPr>
           <w:r>
             <w:fldChar w:fldCharType="begin"/>
-          </w:r>
-          <w:r>
             <w:instrText>TOC \h \o "1-3"</w:instrText>
-          </w:r>
-          <w:r>
             <w:fldChar w:fldCharType="separate"/>
           </w:r>
           <w:hyperlink w:anchor="_Toc241008491" w:history="1">
@@ -151,40 +147,10 @@
                 <w:noProof/>
               </w:rPr>
               <w:tab/>
-            </w:r>
-            <w:r>
-              <w:rPr>
-                <w:noProof/>
-              </w:rPr>
               <w:fldChar w:fldCharType="begin"/>
-            </w:r>
-            <w:r>
-              <w:rPr>
-                <w:noProof/>
-              </w:rPr>
               <w:instrText xml:space="preserve"> PAGEREF _Toc241008491 \h </w:instrText>
-            </w:r>
-            <w:r>
-              <w:rPr>
-                <w:noProof/>
-              </w:rPr>
-            </w:r>
-            <w:r>
-              <w:rPr>
-                <w:noProof/>
-              </w:rPr>
               <w:fldChar w:fldCharType="separate"/>
-            </w:r>
-            <w:r>
-              <w:rPr>
-                <w:noProof/>
-              </w:rPr>
               <w:t>2</w:t>
-            </w:r>
-            <w:r>
-              <w:rPr>
-                <w:noProof/>
-              </w:rPr>
               <w:fldChar w:fldCharType="end"/>
             </w:r>
           </w:hyperlink>
@@ -214,40 +180,10 @@
                 <w:noProof/>
               </w:rPr>
               <w:tab/>
-            </w:r>
-            <w:r>
-              <w:rPr>
-                <w:noProof/>
-              </w:rPr>
               <w:fldChar w:fldCharType="begin"/>
-            </w:r>
-            <w:r>
-              <w:rPr>
-                <w:noProof/>
-              </w:rPr>
               <w:instrText xml:space="preserve"> PAGEREF _Toc241008492 \h </w:instrText>
-            </w:r>
-            <w:r>
-              <w:rPr>
-                <w:noProof/>
-              </w:rPr>
-            </w:r>
-            <w:r>
-              <w:rPr>
-                <w:noProof/>
-              </w:rPr>
               <w:fldChar w:fldCharType="separate"/>
-            </w:r>
-            <w:r>
-              <w:rPr>
-                <w:noProof/>
-              </w:rPr>
               <w:t>3</w:t>
-            </w:r>
-            <w:r>
-              <w:rPr>
-                <w:noProof/>
-              </w:rPr>
               <w:fldChar w:fldCharType="end"/>
             </w:r>
           </w:hyperlink>
@@ -277,40 +213,10 @@
                 <w:noProof/>
               </w:rPr>
               <w:tab/>
-            </w:r>
-            <w:r>
-              <w:rPr>
-                <w:noProof/>
-              </w:rPr>
               <w:fldChar w:fldCharType="begin"/>
-            </w:r>
-            <w:r>
-              <w:rPr>
-                <w:noProof/>
-              </w:rPr>
               <w:instrText xml:space="preserve"> PAGEREF _Toc241008493 \h </w:instrText>
-            </w:r>
-            <w:r>
-              <w:rPr>
-                <w:noProof/>
-              </w:rPr>
-            </w:r>
-            <w:r>
-              <w:rPr>
-                <w:noProof/>
-              </w:rPr>
               <w:fldChar w:fldCharType="separate"/>
-            </w:r>
-            <w:r>
-              <w:rPr>
-                <w:noProof/>
-              </w:rPr>
               <w:t>3</w:t>
-            </w:r>
-            <w:r>
-              <w:rPr>
-                <w:noProof/>
-              </w:rPr>
               <w:fldChar w:fldCharType="end"/>
             </w:r>
           </w:hyperlink>
@@ -340,40 +246,10 @@
                 <w:noProof/>
               </w:rPr>
               <w:tab/>
-            </w:r>
-            <w:r>
-              <w:rPr>
-                <w:noProof/>
-              </w:rPr>
               <w:fldChar w:fldCharType="begin"/>
-            </w:r>
-            <w:r>
-              <w:rPr>
-                <w:noProof/>
-              </w:rPr>
               <w:instrText xml:space="preserve"> PAGEREF _Toc241008494 \h </w:instrText>
-            </w:r>
-            <w:r>
-              <w:rPr>
-                <w:noProof/>
-              </w:rPr>
-            </w:r>
-            <w:r>
-              <w:rPr>
-                <w:noProof/>
-              </w:rPr>
               <w:fldChar w:fldCharType="separate"/>
-            </w:r>
-            <w:r>
-              <w:rPr>
-                <w:noProof/>
-              </w:rPr>
               <w:t>3</w:t>
-            </w:r>
-            <w:r>
-              <w:rPr>
-                <w:noProof/>
-              </w:rPr>
               <w:fldChar w:fldCharType="end"/>
             </w:r>
           </w:hyperlink>
@@ -403,40 +279,10 @@
                 <w:noProof/>
               </w:rPr>
               <w:tab/>
-            </w:r>
-            <w:r>
-              <w:rPr>
-                <w:noProof/>
-              </w:rPr>
               <w:fldChar w:fldCharType="begin"/>
-            </w:r>
-            <w:r>
-              <w:rPr>
-                <w:noProof/>
-              </w:rPr>
               <w:instrText xml:space="preserve"> PAGEREF _Toc241008495 \h </w:instrText>
-            </w:r>
-            <w:r>
-              <w:rPr>
-                <w:noProof/>
-              </w:rPr>
-            </w:r>
-            <w:r>
-              <w:rPr>
-                <w:noProof/>
-              </w:rPr>
               <w:fldChar w:fldCharType="separate"/>
-            </w:r>
-            <w:r>
-              <w:rPr>
-                <w:noProof/>
-              </w:rPr>
               <w:t>3</w:t>
-            </w:r>
-            <w:r>
-              <w:rPr>
-                <w:noProof/>
-              </w:rPr>
               <w:fldChar w:fldCharType="end"/>
             </w:r>
           </w:hyperlink>
@@ -466,40 +312,10 @@
                 <w:noProof/>
               </w:rPr>
               <w:tab/>
-            </w:r>
-            <w:r>
-              <w:rPr>
-                <w:noProof/>
-              </w:rPr>
               <w:fldChar w:fldCharType="begin"/>
-            </w:r>
-            <w:r>
-              <w:rPr>
-                <w:noProof/>
-              </w:rPr>
               <w:instrText xml:space="preserve"> PAGEREF _Toc241008496 \h </w:instrText>
-            </w:r>
-            <w:r>
-              <w:rPr>
-                <w:noProof/>
-              </w:rPr>
-            </w:r>
-            <w:r>
-              <w:rPr>
-                <w:noProof/>
-              </w:rPr>
               <w:fldChar w:fldCharType="separate"/>
-            </w:r>
-            <w:r>
-              <w:rPr>
-                <w:noProof/>
-              </w:rPr>
               <w:t>3</w:t>
-            </w:r>
-            <w:r>
-              <w:rPr>
-                <w:noProof/>
-              </w:rPr>
               <w:fldChar w:fldCharType="end"/>
             </w:r>
           </w:hyperlink>
@@ -529,40 +345,10 @@
                 <w:noProof/>
               </w:rPr>
               <w:tab/>
-            </w:r>
-            <w:r>
-              <w:rPr>
-                <w:noProof/>
-              </w:rPr>
               <w:fldChar w:fldCharType="begin"/>
-            </w:r>
-            <w:r>
-              <w:rPr>
-                <w:noProof/>
-              </w:rPr>
               <w:instrText xml:space="preserve"> PAGEREF _Toc241008497 \h </w:instrText>
-            </w:r>
-            <w:r>
-              <w:rPr>
-                <w:noProof/>
-              </w:rPr>
-            </w:r>
-            <w:r>
-              <w:rPr>
-                <w:noProof/>
-              </w:rPr>
               <w:fldChar w:fldCharType="separate"/>
-            </w:r>
-            <w:r>
-              <w:rPr>
-                <w:noProof/>
-              </w:rPr>
               <w:t>4</w:t>
-            </w:r>
-            <w:r>
-              <w:rPr>
-                <w:noProof/>
-              </w:rPr>
               <w:fldChar w:fldCharType="end"/>
             </w:r>
           </w:hyperlink>
@@ -592,40 +378,10 @@
                 <w:noProof/>
               </w:rPr>
               <w:tab/>
-            </w:r>
-            <w:r>
-              <w:rPr>
-                <w:noProof/>
-              </w:rPr>
               <w:fldChar w:fldCharType="begin"/>
-            </w:r>
-            <w:r>
-              <w:rPr>
-                <w:noProof/>
-              </w:rPr>
               <w:instrText xml:space="preserve"> PAGEREF _Toc241008498 \h </w:instrText>
-            </w:r>
-            <w:r>
-              <w:rPr>
-                <w:noProof/>
-              </w:rPr>
-            </w:r>
-            <w:r>
-              <w:rPr>
-                <w:noProof/>
-              </w:rPr>
               <w:fldChar w:fldCharType="separate"/>
-            </w:r>
-            <w:r>
-              <w:rPr>
-                <w:noProof/>
-              </w:rPr>
               <w:t>4</w:t>
-            </w:r>
-            <w:r>
-              <w:rPr>
-                <w:noProof/>
-              </w:rPr>
               <w:fldChar w:fldCharType="end"/>
             </w:r>
           </w:hyperlink>
@@ -655,40 +411,10 @@
                 <w:noProof/>
               </w:rPr>
               <w:tab/>
-            </w:r>
-            <w:r>
-              <w:rPr>
-                <w:noProof/>
-              </w:rPr>
               <w:fldChar w:fldCharType="begin"/>
-            </w:r>
-            <w:r>
-              <w:rPr>
-                <w:noProof/>
-              </w:rPr>
               <w:instrText xml:space="preserve"> PAGEREF _Toc241008499 \h </w:instrText>
-            </w:r>
-            <w:r>
-              <w:rPr>
-                <w:noProof/>
-              </w:rPr>
-            </w:r>
-            <w:r>
-              <w:rPr>
-                <w:noProof/>
-              </w:rPr>
               <w:fldChar w:fldCharType="separate"/>
-            </w:r>
-            <w:r>
-              <w:rPr>
-                <w:noProof/>
-              </w:rPr>
               <w:t>5</w:t>
-            </w:r>
-            <w:r>
-              <w:rPr>
-                <w:noProof/>
-              </w:rPr>
               <w:fldChar w:fldCharType="end"/>
             </w:r>
           </w:hyperlink>
@@ -718,40 +444,10 @@
                 <w:noProof/>
               </w:rPr>
               <w:tab/>
-            </w:r>
-            <w:r>
-              <w:rPr>
-                <w:noProof/>
-              </w:rPr>
               <w:fldChar w:fldCharType="begin"/>
-            </w:r>
-            <w:r>
-              <w:rPr>
-                <w:noProof/>
-              </w:rPr>
               <w:instrText xml:space="preserve"> PAGEREF _Toc241008500 \h </w:instrText>
-            </w:r>
-            <w:r>
-              <w:rPr>
-                <w:noProof/>
-              </w:rPr>
-            </w:r>
-            <w:r>
-              <w:rPr>
-                <w:noProof/>
-              </w:rPr>
               <w:fldChar w:fldCharType="separate"/>
-            </w:r>
-            <w:r>
-              <w:rPr>
-                <w:noProof/>
-              </w:rPr>
               <w:t>5</w:t>
-            </w:r>
-            <w:r>
-              <w:rPr>
-                <w:noProof/>
-              </w:rPr>
               <w:fldChar w:fldCharType="end"/>
             </w:r>
           </w:hyperlink>
@@ -781,40 +477,10 @@
                 <w:noProof/>
               </w:rPr>
               <w:tab/>
-            </w:r>
-            <w:r>
-              <w:rPr>
-                <w:noProof/>
-              </w:rPr>
               <w:fldChar w:fldCharType="begin"/>
-            </w:r>
-            <w:r>
-              <w:rPr>
-                <w:noProof/>
-              </w:rPr>
               <w:instrText xml:space="preserve"> PAGEREF _Toc241008501 \h </w:instrText>
-            </w:r>
-            <w:r>
-              <w:rPr>
-                <w:noProof/>
-              </w:rPr>
-            </w:r>
-            <w:r>
-              <w:rPr>
-                <w:noProof/>
-              </w:rPr>
               <w:fldChar w:fldCharType="separate"/>
-            </w:r>
-            <w:r>
-              <w:rPr>
-                <w:noProof/>
-              </w:rPr>
               <w:t>6</w:t>
-            </w:r>
-            <w:r>
-              <w:rPr>
-                <w:noProof/>
-              </w:rPr>
               <w:fldChar w:fldCharType="end"/>
             </w:r>
           </w:hyperlink>
@@ -844,40 +510,10 @@
                 <w:noProof/>
               </w:rPr>
               <w:tab/>
-            </w:r>
-            <w:r>
-              <w:rPr>
-                <w:noProof/>
-              </w:rPr>
               <w:fldChar w:fldCharType="begin"/>
-            </w:r>
-            <w:r>
-              <w:rPr>
-                <w:noProof/>
-              </w:rPr>
               <w:instrText xml:space="preserve"> PAGEREF _Toc241008502 \h </w:instrText>
-            </w:r>
-            <w:r>
-              <w:rPr>
-                <w:noProof/>
-              </w:rPr>
-            </w:r>
-            <w:r>
-              <w:rPr>
-                <w:noProof/>
-              </w:rPr>
               <w:fldChar w:fldCharType="separate"/>
-            </w:r>
-            <w:r>
-              <w:rPr>
-                <w:noProof/>
-              </w:rPr>
               <w:t>6</w:t>
-            </w:r>
-            <w:r>
-              <w:rPr>
-                <w:noProof/>
-              </w:rPr>
               <w:fldChar w:fldCharType="end"/>
             </w:r>
           </w:hyperlink>
@@ -907,40 +543,10 @@
                 <w:noProof/>
               </w:rPr>
               <w:tab/>
-            </w:r>
-            <w:r>
-              <w:rPr>
-                <w:noProof/>
-              </w:rPr>
               <w:fldChar w:fldCharType="begin"/>
-            </w:r>
-            <w:r>
-              <w:rPr>
-                <w:noProof/>
-              </w:rPr>
               <w:instrText xml:space="preserve"> PAGEREF _Toc241008503 \h </w:instrText>
-            </w:r>
-            <w:r>
-              <w:rPr>
-                <w:noProof/>
-              </w:rPr>
-            </w:r>
-            <w:r>
-              <w:rPr>
-                <w:noProof/>
-              </w:rPr>
               <w:fldChar w:fldCharType="separate"/>
-            </w:r>
-            <w:r>
-              <w:rPr>
-                <w:noProof/>
-              </w:rPr>
               <w:t>6</w:t>
-            </w:r>
-            <w:r>
-              <w:rPr>
-                <w:noProof/>
-              </w:rPr>
               <w:fldChar w:fldCharType="end"/>
             </w:r>
           </w:hyperlink>
@@ -970,40 +576,10 @@
                 <w:noProof/>
               </w:rPr>
               <w:tab/>
-            </w:r>
-            <w:r>
-              <w:rPr>
-                <w:noProof/>
-              </w:rPr>
               <w:fldChar w:fldCharType="begin"/>
-            </w:r>
-            <w:r>
-              <w:rPr>
-                <w:noProof/>
-              </w:rPr>
               <w:instrText xml:space="preserve"> PAGEREF _Toc241008504 \h </w:instrText>
-            </w:r>
-            <w:r>
-              <w:rPr>
-                <w:noProof/>
-              </w:rPr>
-            </w:r>
-            <w:r>
-              <w:rPr>
-                <w:noProof/>
-              </w:rPr>
               <w:fldChar w:fldCharType="separate"/>
-            </w:r>
-            <w:r>
-              <w:rPr>
-                <w:noProof/>
-              </w:rPr>
               <w:t>6</w:t>
-            </w:r>
-            <w:r>
-              <w:rPr>
-                <w:noProof/>
-              </w:rPr>
               <w:fldChar w:fldCharType="end"/>
             </w:r>
           </w:hyperlink>
@@ -1033,40 +609,10 @@
                 <w:noProof/>
               </w:rPr>
               <w:tab/>
-            </w:r>
-            <w:r>
-              <w:rPr>
-                <w:noProof/>
-              </w:rPr>
               <w:fldChar w:fldCharType="begin"/>
-            </w:r>
-            <w:r>
-              <w:rPr>
-                <w:noProof/>
-              </w:rPr>
               <w:instrText xml:space="preserve"> PAGEREF _Toc241008505 \h </w:instrText>
-            </w:r>
-            <w:r>
-              <w:rPr>
-                <w:noProof/>
-              </w:rPr>
-            </w:r>
-            <w:r>
-              <w:rPr>
-                <w:noProof/>
-              </w:rPr>
               <w:fldChar w:fldCharType="separate"/>
-            </w:r>
-            <w:r>
-              <w:rPr>
-                <w:noProof/>
-              </w:rPr>
               <w:t>6</w:t>
-            </w:r>
-            <w:r>
-              <w:rPr>
-                <w:noProof/>
-              </w:rPr>
               <w:fldChar w:fldCharType="end"/>
             </w:r>
           </w:hyperlink>
@@ -1096,40 +642,10 @@
                 <w:noProof/>
               </w:rPr>
               <w:tab/>
-            </w:r>
-            <w:r>
-              <w:rPr>
-                <w:noProof/>
-              </w:rPr>
               <w:fldChar w:fldCharType="begin"/>
-            </w:r>
-            <w:r>
-              <w:rPr>
-                <w:noProof/>
-              </w:rPr>
               <w:instrText xml:space="preserve"> PAGEREF _Toc241008506 \h </w:instrText>
-            </w:r>
-            <w:r>
-              <w:rPr>
-                <w:noProof/>
-              </w:rPr>
-            </w:r>
-            <w:r>
-              <w:rPr>
-                <w:noProof/>
-              </w:rPr>
               <w:fldChar w:fldCharType="separate"/>
-            </w:r>
-            <w:r>
-              <w:rPr>
-                <w:noProof/>
-              </w:rPr>
               <w:t>6</w:t>
-            </w:r>
-            <w:r>
-              <w:rPr>
-                <w:noProof/>
-              </w:rPr>
               <w:fldChar w:fldCharType="end"/>
             </w:r>
           </w:hyperlink>
@@ -1152,47 +668,17 @@
                 <w:bCs/>
                 <w:noProof/>
               </w:rPr>
-              <w:t>2.6 ตรรกะทางธุรกิจที่ระบบจัดการให้อัตโนมัติ</w:t>
+              <w:t>2.8 ตรรกะทางธุรกิจที่ระบบจัดการให้อัตโนมัติ</w:t>
             </w:r>
             <w:r>
               <w:rPr>
                 <w:noProof/>
               </w:rPr>
               <w:tab/>
-            </w:r>
-            <w:r>
-              <w:rPr>
-                <w:noProof/>
-              </w:rPr>
               <w:fldChar w:fldCharType="begin"/>
-            </w:r>
-            <w:r>
-              <w:rPr>
-                <w:noProof/>
-              </w:rPr>
               <w:instrText xml:space="preserve"> PAGEREF _Toc241008507 \h </w:instrText>
-            </w:r>
-            <w:r>
-              <w:rPr>
-                <w:noProof/>
-              </w:rPr>
-            </w:r>
-            <w:r>
-              <w:rPr>
-                <w:noProof/>
-              </w:rPr>
               <w:fldChar w:fldCharType="separate"/>
-            </w:r>
-            <w:r>
-              <w:rPr>
-                <w:noProof/>
-              </w:rPr>
               <w:t>7</w:t>
-            </w:r>
-            <w:r>
-              <w:rPr>
-                <w:noProof/>
-              </w:rPr>
               <w:fldChar w:fldCharType="end"/>
             </w:r>
           </w:hyperlink>
@@ -1222,40 +708,10 @@
                 <w:noProof/>
               </w:rPr>
               <w:tab/>
-            </w:r>
-            <w:r>
-              <w:rPr>
-                <w:noProof/>
-              </w:rPr>
               <w:fldChar w:fldCharType="begin"/>
-            </w:r>
-            <w:r>
-              <w:rPr>
-                <w:noProof/>
-              </w:rPr>
               <w:instrText xml:space="preserve"> PAGEREF _Toc241008508 \h </w:instrText>
-            </w:r>
-            <w:r>
-              <w:rPr>
-                <w:noProof/>
-              </w:rPr>
-            </w:r>
-            <w:r>
-              <w:rPr>
-                <w:noProof/>
-              </w:rPr>
               <w:fldChar w:fldCharType="separate"/>
-            </w:r>
-            <w:r>
-              <w:rPr>
-                <w:noProof/>
-              </w:rPr>
               <w:t>8</w:t>
-            </w:r>
-            <w:r>
-              <w:rPr>
-                <w:noProof/>
-              </w:rPr>
               <w:fldChar w:fldCharType="end"/>
             </w:r>
           </w:hyperlink>
@@ -1285,40 +741,10 @@
                 <w:noProof/>
               </w:rPr>
               <w:tab/>
-            </w:r>
-            <w:r>
-              <w:rPr>
-                <w:noProof/>
-              </w:rPr>
               <w:fldChar w:fldCharType="begin"/>
-            </w:r>
-            <w:r>
-              <w:rPr>
-                <w:noProof/>
-              </w:rPr>
               <w:instrText xml:space="preserve"> PAGEREF _Toc241008509 \h </w:instrText>
-            </w:r>
-            <w:r>
-              <w:rPr>
-                <w:noProof/>
-              </w:rPr>
-            </w:r>
-            <w:r>
-              <w:rPr>
-                <w:noProof/>
-              </w:rPr>
               <w:fldChar w:fldCharType="separate"/>
-            </w:r>
-            <w:r>
-              <w:rPr>
-                <w:noProof/>
-              </w:rPr>
               <w:t>8</w:t>
-            </w:r>
-            <w:r>
-              <w:rPr>
-                <w:noProof/>
-              </w:rPr>
               <w:fldChar w:fldCharType="end"/>
             </w:r>
           </w:hyperlink>
@@ -1348,40 +774,10 @@
                 <w:noProof/>
               </w:rPr>
               <w:tab/>
-            </w:r>
-            <w:r>
-              <w:rPr>
-                <w:noProof/>
-              </w:rPr>
               <w:fldChar w:fldCharType="begin"/>
-            </w:r>
-            <w:r>
-              <w:rPr>
-                <w:noProof/>
-              </w:rPr>
               <w:instrText xml:space="preserve"> PAGEREF _Toc241008510 \h </w:instrText>
-            </w:r>
-            <w:r>
-              <w:rPr>
-                <w:noProof/>
-              </w:rPr>
-            </w:r>
-            <w:r>
-              <w:rPr>
-                <w:noProof/>
-              </w:rPr>
               <w:fldChar w:fldCharType="separate"/>
-            </w:r>
-            <w:r>
-              <w:rPr>
-                <w:noProof/>
-              </w:rPr>
               <w:t>11</w:t>
-            </w:r>
-            <w:r>
-              <w:rPr>
-                <w:noProof/>
-              </w:rPr>
               <w:fldChar w:fldCharType="end"/>
             </w:r>
           </w:hyperlink>
@@ -1411,40 +807,10 @@
                 <w:noProof/>
               </w:rPr>
               <w:tab/>
-            </w:r>
-            <w:r>
-              <w:rPr>
-                <w:noProof/>
-              </w:rPr>
               <w:fldChar w:fldCharType="begin"/>
-            </w:r>
-            <w:r>
-              <w:rPr>
-                <w:noProof/>
-              </w:rPr>
               <w:instrText xml:space="preserve"> PAGEREF _Toc241008511 \h </w:instrText>
-            </w:r>
-            <w:r>
-              <w:rPr>
-                <w:noProof/>
-              </w:rPr>
-            </w:r>
-            <w:r>
-              <w:rPr>
-                <w:noProof/>
-              </w:rPr>
               <w:fldChar w:fldCharType="separate"/>
-            </w:r>
-            <w:r>
-              <w:rPr>
-                <w:noProof/>
-              </w:rPr>
               <w:t>11</w:t>
-            </w:r>
-            <w:r>
-              <w:rPr>
-                <w:noProof/>
-              </w:rPr>
               <w:fldChar w:fldCharType="end"/>
             </w:r>
           </w:hyperlink>
@@ -1474,40 +840,10 @@
                 <w:noProof/>
               </w:rPr>
               <w:tab/>
-            </w:r>
-            <w:r>
-              <w:rPr>
-                <w:noProof/>
-              </w:rPr>
               <w:fldChar w:fldCharType="begin"/>
-            </w:r>
-            <w:r>
-              <w:rPr>
-                <w:noProof/>
-              </w:rPr>
               <w:instrText xml:space="preserve"> PAGEREF _Toc241008512 \h </w:instrText>
-            </w:r>
-            <w:r>
-              <w:rPr>
-                <w:noProof/>
-              </w:rPr>
-            </w:r>
-            <w:r>
-              <w:rPr>
-                <w:noProof/>
-              </w:rPr>
               <w:fldChar w:fldCharType="separate"/>
-            </w:r>
-            <w:r>
-              <w:rPr>
-                <w:noProof/>
-              </w:rPr>
               <w:t>11</w:t>
-            </w:r>
-            <w:r>
-              <w:rPr>
-                <w:noProof/>
-              </w:rPr>
               <w:fldChar w:fldCharType="end"/>
             </w:r>
           </w:hyperlink>
@@ -1537,40 +873,10 @@
                 <w:noProof/>
               </w:rPr>
               <w:tab/>
-            </w:r>
-            <w:r>
-              <w:rPr>
-                <w:noProof/>
-              </w:rPr>
               <w:fldChar w:fldCharType="begin"/>
-            </w:r>
-            <w:r>
-              <w:rPr>
-                <w:noProof/>
-              </w:rPr>
               <w:instrText xml:space="preserve"> PAGEREF _Toc241008513 \h </w:instrText>
-            </w:r>
-            <w:r>
-              <w:rPr>
-                <w:noProof/>
-              </w:rPr>
-            </w:r>
-            <w:r>
-              <w:rPr>
-                <w:noProof/>
-              </w:rPr>
               <w:fldChar w:fldCharType="separate"/>
-            </w:r>
-            <w:r>
-              <w:rPr>
-                <w:noProof/>
-              </w:rPr>
               <w:t>11</w:t>
-            </w:r>
-            <w:r>
-              <w:rPr>
-                <w:noProof/>
-              </w:rPr>
               <w:fldChar w:fldCharType="end"/>
             </w:r>
           </w:hyperlink>
@@ -1600,40 +906,10 @@
                 <w:noProof/>
               </w:rPr>
               <w:tab/>
-            </w:r>
-            <w:r>
-              <w:rPr>
-                <w:noProof/>
-              </w:rPr>
               <w:fldChar w:fldCharType="begin"/>
-            </w:r>
-            <w:r>
-              <w:rPr>
-                <w:noProof/>
-              </w:rPr>
               <w:instrText xml:space="preserve"> PAGEREF _Toc241008514 \h </w:instrText>
-            </w:r>
-            <w:r>
-              <w:rPr>
-                <w:noProof/>
-              </w:rPr>
-            </w:r>
-            <w:r>
-              <w:rPr>
-                <w:noProof/>
-              </w:rPr>
               <w:fldChar w:fldCharType="separate"/>
-            </w:r>
-            <w:r>
-              <w:rPr>
-                <w:noProof/>
-              </w:rPr>
               <w:t>12</w:t>
-            </w:r>
-            <w:r>
-              <w:rPr>
-                <w:noProof/>
-              </w:rPr>
               <w:fldChar w:fldCharType="end"/>
             </w:r>
           </w:hyperlink>
@@ -1663,40 +939,10 @@
                 <w:noProof/>
               </w:rPr>
               <w:tab/>
-            </w:r>
-            <w:r>
-              <w:rPr>
-                <w:noProof/>
-              </w:rPr>
               <w:fldChar w:fldCharType="begin"/>
-            </w:r>
-            <w:r>
-              <w:rPr>
-                <w:noProof/>
-              </w:rPr>
               <w:instrText xml:space="preserve"> PAGEREF _Toc241008515 \h </w:instrText>
-            </w:r>
-            <w:r>
-              <w:rPr>
-                <w:noProof/>
-              </w:rPr>
-            </w:r>
-            <w:r>
-              <w:rPr>
-                <w:noProof/>
-              </w:rPr>
               <w:fldChar w:fldCharType="separate"/>
-            </w:r>
-            <w:r>
-              <w:rPr>
-                <w:noProof/>
-              </w:rPr>
               <w:t>12</w:t>
-            </w:r>
-            <w:r>
-              <w:rPr>
-                <w:noProof/>
-              </w:rPr>
               <w:fldChar w:fldCharType="end"/>
             </w:r>
           </w:hyperlink>
@@ -1726,40 +972,10 @@
                 <w:noProof/>
               </w:rPr>
               <w:tab/>
-            </w:r>
-            <w:r>
-              <w:rPr>
-                <w:noProof/>
-              </w:rPr>
               <w:fldChar w:fldCharType="begin"/>
-            </w:r>
-            <w:r>
-              <w:rPr>
-                <w:noProof/>
-              </w:rPr>
               <w:instrText xml:space="preserve"> PAGEREF _Toc241008516 \h </w:instrText>
-            </w:r>
-            <w:r>
-              <w:rPr>
-                <w:noProof/>
-              </w:rPr>
-            </w:r>
-            <w:r>
-              <w:rPr>
-                <w:noProof/>
-              </w:rPr>
               <w:fldChar w:fldCharType="separate"/>
-            </w:r>
-            <w:r>
-              <w:rPr>
-                <w:noProof/>
-              </w:rPr>
               <w:t>12</w:t>
-            </w:r>
-            <w:r>
-              <w:rPr>
-                <w:noProof/>
-              </w:rPr>
               <w:fldChar w:fldCharType="end"/>
             </w:r>
           </w:hyperlink>
@@ -1789,40 +1005,10 @@
                 <w:noProof/>
               </w:rPr>
               <w:tab/>
-            </w:r>
-            <w:r>
-              <w:rPr>
-                <w:noProof/>
-              </w:rPr>
               <w:fldChar w:fldCharType="begin"/>
-            </w:r>
-            <w:r>
-              <w:rPr>
-                <w:noProof/>
-              </w:rPr>
               <w:instrText xml:space="preserve"> PAGEREF _Toc241008517 \h </w:instrText>
-            </w:r>
-            <w:r>
-              <w:rPr>
-                <w:noProof/>
-              </w:rPr>
-            </w:r>
-            <w:r>
-              <w:rPr>
-                <w:noProof/>
-              </w:rPr>
               <w:fldChar w:fldCharType="separate"/>
-            </w:r>
-            <w:r>
-              <w:rPr>
-                <w:noProof/>
-              </w:rPr>
               <w:t>12</w:t>
-            </w:r>
-            <w:r>
-              <w:rPr>
-                <w:noProof/>
-              </w:rPr>
               <w:fldChar w:fldCharType="end"/>
             </w:r>
           </w:hyperlink>
@@ -5768,14 +4954,137 @@
         <w:pStyle w:val="Heading2"/>
         <w:spacing w:before="320" w:after="140"/>
       </w:pPr>
-      <w:bookmarkStart w:id="16" w:name="_Toc241008507"/>
+      <w:bookmarkStart w:id="900" w:name="_Toc900001"/>
       <w:r>
         <w:rPr>
           <w:b/>
           <w:bCs/>
           <w:color w:val="9A653F"/>
         </w:rPr>
-        <w:t>2.6 ตรรกะทางธุรกิจที่ระบบจัดการให้อัตโนมัติ</w:t>
+        <w:t>2.6 หน้าสัญญาที่มีอยู่ (Active Contracts)</w:t>
+      </w:r>
+      <w:bookmarkEnd w:id="900"/>
+    </w:p>
+    <w:p>
+      <w:pPr>
+        <w:pStyle w:val="ListParagraph"/>
+        <w:numPr>
+          <w:ilvl w:val="0"/>
+          <w:numId w:val="3"/>
+        </w:numPr>
+        <w:spacing w:after="80" w:line="280" w:lineRule="auto"/>
+      </w:pPr>
+      <w:r>
+        <w:t>เมนู "สัญญาที่มีอยู่" (/loans) แสดงรายการสัญญาเงินกู้ที่ยังไม่ปิด (status = active) ทั้งหมด เรียงตามวันครบกำหนดงวดถัดไปจากใกล้สุดไปไกลสุด</w:t>
+      </w:r>
+    </w:p>
+    <w:p>
+      <w:pPr>
+        <w:pStyle w:val="ListParagraph"/>
+        <w:numPr>
+          <w:ilvl w:val="0"/>
+          <w:numId w:val="3"/>
+        </w:numPr>
+        <w:spacing w:after="80" w:line="280" w:lineRule="auto"/>
+      </w:pPr>
+      <w:r>
+        <w:t>แต่ละรายการแสดงชื่อลูกหนี้ เงินต้น อัตราดอกเบี้ย วันครบกำหนดงวดถัดไป ยอดที่เก็บแล้ว/ยอดรวม และป้าย "เกินกำหนด" หากมีงวดค้างชำระเกินวันครบกำหนด</w:t>
+      </w:r>
+    </w:p>
+    <w:p>
+      <w:pPr>
+        <w:pStyle w:val="ListParagraph"/>
+        <w:numPr>
+          <w:ilvl w:val="0"/>
+          <w:numId w:val="3"/>
+        </w:numPr>
+        <w:spacing w:after="80" w:line="280" w:lineRule="auto"/>
+      </w:pPr>
+      <w:r>
+        <w:t>คลิกแต่ละรายการเพื่อไปยังหน้ารายละเอียดลูกหนี้</w:t>
+      </w:r>
+    </w:p>
+    <w:p>
+      <w:pPr>
+        <w:pStyle w:val="Heading2"/>
+        <w:spacing w:before="320" w:after="140"/>
+      </w:pPr>
+      <w:bookmarkStart w:id="901" w:name="_Toc900002"/>
+      <w:r>
+        <w:rPr>
+          <w:b/>
+          <w:bCs/>
+          <w:color w:val="9A653F"/>
+        </w:rPr>
+        <w:t>2.7 หน้าปฏิทิน (Calendar)</w:t>
+      </w:r>
+      <w:bookmarkEnd w:id="901"/>
+    </w:p>
+    <w:p>
+      <w:pPr>
+        <w:pStyle w:val="ListParagraph"/>
+        <w:numPr>
+          <w:ilvl w:val="0"/>
+          <w:numId w:val="3"/>
+        </w:numPr>
+        <w:spacing w:after="80" w:line="280" w:lineRule="auto"/>
+      </w:pPr>
+      <w:r>
+        <w:t>เมนู "ปฏิทิน" (/calendar) แสดงปฏิทินรายเดือนของวันครบกำหนดชำระงวด (installment due date) จากสัญญาที่ยัง active ทั้งหมด</w:t>
+      </w:r>
+    </w:p>
+    <w:p>
+      <w:pPr>
+        <w:pStyle w:val="ListParagraph"/>
+        <w:numPr>
+          <w:ilvl w:val="0"/>
+          <w:numId w:val="3"/>
+        </w:numPr>
+        <w:spacing w:after="80" w:line="280" w:lineRule="auto"/>
+      </w:pPr>
+      <w:r>
+        <w:t>วันที่มีงวดครบกำหนดจะแสดงจำนวนรายการในช่องปฏิทิน ใช้ปุ่ม "ก่อนหน้า" / "ถัดไป" เพื่อเปลี่ยนเดือนที่ดู</w:t>
+      </w:r>
+    </w:p>
+    <w:p>
+      <w:pPr>
+        <w:pStyle w:val="ListParagraph"/>
+        <w:numPr>
+          <w:ilvl w:val="0"/>
+          <w:numId w:val="3"/>
+        </w:numPr>
+        <w:spacing w:after="80" w:line="280" w:lineRule="auto"/>
+      </w:pPr>
+      <w:r>
+        <w:t>ด้านล่างปฏิทินมีรายการ "ครบกำหนดในเดือนนี้" แบบลิสต์ แสดงชื่อลูกหนี้ วันที่ครบกำหนด และจำนวนเงิน พร้อมป้าย "เกินกำหนด" หากงวดนั้นเลยกำหนดแล้ว คลิกเพื่อไปหน้ารายละเอียดลูกหนี้</w:t>
+      </w:r>
+    </w:p>
+    <w:p>
+      <w:pPr>
+        <w:pStyle w:val="ListParagraph"/>
+        <w:numPr>
+          <w:ilvl w:val="0"/>
+          <w:numId w:val="3"/>
+        </w:numPr>
+        <w:spacing w:after="80" w:line="280" w:lineRule="auto"/>
+      </w:pPr>
+      <w:r>
+        <w:t>หมายเหตุ: ยังไม่รองรับการซิงก์กับ Google Calendar จริง เป็นปฏิทินที่คำนวณจากข้อมูลงวดชำระในระบบเท่านั้น</w:t>
+      </w:r>
+    </w:p>
+    <w:p>
+      <w:pPr>
+        <w:pStyle w:val="Heading2"/>
+        <w:spacing w:before="320" w:after="140"/>
+      </w:pPr>
+      <w:bookmarkStart w:id="16" w:name="_Toc241008507"/>
+      <w:r>
+        <w:rPr>
+          <w:b/>
+          <w:bCs/>
+          <w:color w:val="9A653F"/>
+        </w:rPr>
+        <w:t>2.8 ตรรกะทางธุรกิจที่ระบบจัดการให้อัตโนมัติ</w:t>
       </w:r>
       <w:bookmarkEnd w:id="16"/>
     </w:p>
@@ -6510,7 +5819,7 @@
         <w:spacing w:after="80" w:line="280" w:lineRule="auto"/>
       </w:pPr>
       <w:r>
-        <w:t>ระบบจะพาไปยังหน้ารายละเอียดของลูกหนี้รายนั้นโดยอัตโนมัติ แสดงสัญญาที่เพิ่งสร้างพร้อมตารางงวดชำระ</w:t>
+        <w:t>ระบบจะพาไปยังหน้า "สัญญาที่มีอยู่" (/loans) โดยอัตโนมัติ แสดงสัญญาที่เพิ่งสร้างในรายการสัญญา active ทั้งหมด</w:t>
       </w:r>
     </w:p>
     <w:p>

</xml_diff>

<commit_message>
Split workflow diagram into 3 readable A4-landscape sections
The single tall workflow PNG (2500x7096) was unreadable when scaled to
page width. Replaced it with 3 mermaid-generated flowcharts (Part 1:
create loan, Part 2: record payment, Part 3: early-close at >=80%
paid), each on a landscape A4 page with 18-25pt rendered text.

Co-Authored-By: Claude Sonnet 5 <noreply@anthropic.com>
</commit_message>
<xml_diff>
--- a/docs/MoneyMore_SOP.docx
+++ b/docs/MoneyMore_SOP.docx
@@ -5426,6 +5426,32 @@
     </w:p>
     <w:p>
       <w:pPr>
+        <w:sectPr>
+          <w:pgSz w:w="12240" w:h="15840"/>
+          <w:pgMar w:top="1080" w:right="1080" w:bottom="1080" w:left="1080" w:header="708" w:footer="708" w:gutter="0"/>
+          <w:cols w:space="720"/>
+          <w:docGrid w:linePitch="360"/>
+        </w:sectPr>
+      </w:pPr>
+    </w:p>
+    <w:p>
+      <w:pPr>
+        <w:spacing w:after="200"/>
+        <w:jc w:val="center"/>
+      </w:pPr>
+      <w:r>
+        <w:rPr>
+          <w:i/>
+          <w:iCs/>
+          <w:color w:val="6B6357"/>
+          <w:sz w:val="18"/>
+          <w:szCs w:val="18"/>
+        </w:rPr>
+        <w:t>(หน้านี้เป็นแนวนอนเพื่อให้แผนภาพอ่านง่ายขึ้น — แบ่งเป็น 3 ส่วนตามลำดับการทำงาน)</w:t>
+      </w:r>
+    </w:p>
+    <w:p>
+      <w:pPr>
         <w:spacing w:after="100"/>
         <w:jc w:val="center"/>
       </w:pPr>
@@ -5433,12 +5459,11 @@
         <w:rPr>
           <w:noProof/>
         </w:rPr>
-        <w:lastRenderedPageBreak/>
         <w:drawing>
-          <wp:inline distT="0" distB="0" distL="0" distR="0" wp14:anchorId="3D85F904" wp14:editId="57AED928">
-            <wp:extent cx="5905500" cy="16764000"/>
+          <wp:inline distT="0" distB="0" distL="0" distR="0">
+            <wp:extent cx="9317736" cy="3603544"/>
             <wp:effectExtent l="0" t="0" r="0" b="0"/>
-            <wp:docPr id="1" name="Picture 1"/>
+            <wp:docPr id="0" name="Part1"/>
             <wp:cNvGraphicFramePr>
               <a:graphicFrameLocks xmlns:a="http://schemas.openxmlformats.org/drawingml/2006/main" noChangeAspect="1"/>
             </wp:cNvGraphicFramePr>
@@ -5461,7 +5486,7 @@
                   <pic:spPr bwMode="auto">
                     <a:xfrm>
                       <a:off x="0" y="0"/>
-                      <a:ext cx="5905500" cy="16764000"/>
+                      <a:ext cx="9317736" cy="3603544"/>
                     </a:xfrm>
                     <a:prstGeom prst="rect">
                       <a:avLst/>
@@ -5476,7 +5501,7 @@
     </w:p>
     <w:p>
       <w:pPr>
-        <w:spacing w:after="200"/>
+        <w:spacing w:after="300"/>
         <w:jc w:val="center"/>
       </w:pPr>
       <w:r>
@@ -5487,9 +5512,148 @@
           <w:sz w:val="18"/>
           <w:szCs w:val="18"/>
         </w:rPr>
-        <w:lastRenderedPageBreak/>
-        <w:t>ภาพที่ 1 — ขั้นตอนการทำงานหลักของระบบ MoneyMore (สร้างโดย draw.io)</w:t>
-      </w:r>
+        <w:t>ภาพที่ 1 — Part 1: เข้าสู่ระบบ และสร้างสัญญาใหม่</w:t>
+      </w:r>
+    </w:p>
+    <w:p>
+      <w:pPr>
+        <w:spacing w:after="100"/>
+        <w:jc w:val="center"/>
+      </w:pPr>
+      <w:r>
+        <w:rPr>
+          <w:noProof/>
+        </w:rPr>
+        <w:drawing>
+          <wp:inline distT="0" distB="0" distL="0" distR="0">
+            <wp:extent cx="9317736" cy="4084102"/>
+            <wp:effectExtent l="0" t="0" r="0" b="0"/>
+            <wp:docPr id="0" name="Part2"/>
+            <wp:cNvGraphicFramePr>
+              <a:graphicFrameLocks xmlns:a="http://schemas.openxmlformats.org/drawingml/2006/main" noChangeAspect="1"/>
+            </wp:cNvGraphicFramePr>
+            <a:graphic xmlns:a="http://schemas.openxmlformats.org/drawingml/2006/main">
+              <a:graphicData uri="http://schemas.openxmlformats.org/drawingml/2006/picture">
+                <pic:pic xmlns:pic="http://schemas.openxmlformats.org/drawingml/2006/picture">
+                  <pic:nvPicPr>
+                    <pic:cNvPr id="0" name=""/>
+                    <pic:cNvPicPr>
+                      <a:picLocks noChangeAspect="1" noChangeArrowheads="1"/>
+                    </pic:cNvPicPr>
+                  </pic:nvPicPr>
+                  <pic:blipFill>
+                    <a:blip r:embed="rId8"/>
+                    <a:srcRect/>
+                    <a:stretch>
+                      <a:fillRect/>
+                    </a:stretch>
+                  </pic:blipFill>
+                  <pic:spPr bwMode="auto">
+                    <a:xfrm>
+                      <a:off x="0" y="0"/>
+                      <a:ext cx="9317736" cy="4084102"/>
+                    </a:xfrm>
+                    <a:prstGeom prst="rect">
+                      <a:avLst/>
+                    </a:prstGeom>
+                  </pic:spPr>
+                </pic:pic>
+              </a:graphicData>
+            </a:graphic>
+          </wp:inline>
+        </w:drawing>
+      </w:r>
+    </w:p>
+    <w:p>
+      <w:pPr>
+        <w:spacing w:after="300"/>
+        <w:jc w:val="center"/>
+      </w:pPr>
+      <w:r>
+        <w:rPr>
+          <w:i/>
+          <w:iCs/>
+          <w:color w:val="6B6357"/>
+          <w:sz w:val="18"/>
+          <w:szCs w:val="18"/>
+        </w:rPr>
+        <w:t>ภาพที่ 2 — Part 2: การรับชำระเงิน</w:t>
+      </w:r>
+    </w:p>
+    <w:p>
+      <w:pPr>
+        <w:spacing w:after="100"/>
+        <w:jc w:val="center"/>
+      </w:pPr>
+      <w:r>
+        <w:rPr>
+          <w:noProof/>
+        </w:rPr>
+        <w:drawing>
+          <wp:inline distT="0" distB="0" distL="0" distR="0">
+            <wp:extent cx="9317736" cy="3161455"/>
+            <wp:effectExtent l="0" t="0" r="0" b="0"/>
+            <wp:docPr id="0" name="Part3"/>
+            <wp:cNvGraphicFramePr>
+              <a:graphicFrameLocks xmlns:a="http://schemas.openxmlformats.org/drawingml/2006/main" noChangeAspect="1"/>
+            </wp:cNvGraphicFramePr>
+            <a:graphic xmlns:a="http://schemas.openxmlformats.org/drawingml/2006/main">
+              <a:graphicData uri="http://schemas.openxmlformats.org/drawingml/2006/picture">
+                <pic:pic xmlns:pic="http://schemas.openxmlformats.org/drawingml/2006/picture">
+                  <pic:nvPicPr>
+                    <pic:cNvPr id="0" name=""/>
+                    <pic:cNvPicPr>
+                      <a:picLocks noChangeAspect="1" noChangeArrowheads="1"/>
+                    </pic:cNvPicPr>
+                  </pic:nvPicPr>
+                  <pic:blipFill>
+                    <a:blip r:embed="rId9"/>
+                    <a:srcRect/>
+                    <a:stretch>
+                      <a:fillRect/>
+                    </a:stretch>
+                  </pic:blipFill>
+                  <pic:spPr bwMode="auto">
+                    <a:xfrm>
+                      <a:off x="0" y="0"/>
+                      <a:ext cx="9317736" cy="3161455"/>
+                    </a:xfrm>
+                    <a:prstGeom prst="rect">
+                      <a:avLst/>
+                    </a:prstGeom>
+                  </pic:spPr>
+                </pic:pic>
+              </a:graphicData>
+            </a:graphic>
+          </wp:inline>
+        </w:drawing>
+      </w:r>
+    </w:p>
+    <w:p>
+      <w:pPr>
+        <w:spacing w:after="300"/>
+        <w:jc w:val="center"/>
+      </w:pPr>
+      <w:r>
+        <w:rPr>
+          <w:i/>
+          <w:iCs/>
+          <w:color w:val="6B6357"/>
+          <w:sz w:val="18"/>
+          <w:szCs w:val="18"/>
+        </w:rPr>
+        <w:t>ภาพที่ 3 — Part 3: การปิดยอดก่อนกำหนด (เมื่อสะสมชำระ &gt;= 80%)</w:t>
+      </w:r>
+    </w:p>
+    <w:p>
+      <w:pPr>
+        <w:sectPr>
+          <w:pgSz w:w="16838" w:h="11906" w:orient="landscape"/>
+          <w:pgMar w:top="1080" w:right="1080" w:bottom="1080" w:left="1080" w:header="708" w:footer="708" w:gutter="0"/>
+          <w:cols w:space="720"/>
+          <w:docGrid w:linePitch="360"/>
+        </w:sectPr>
+      </w:pPr>
     </w:p>
     <w:p>
       <w:r>

</xml_diff>